<commit_message>
Mahnung-1-Vorlage: Eskalations- und Verzugszins-Satz sauber getrennt
</commit_message>
<xml_diff>
--- a/public/downloads/mahnung-1.docx
+++ b/public/downloads/mahnung-1.docx
@@ -677,7 +677,21 @@
           <w:rFonts w:ascii="Arial" w:hAnsi="Arial" w:cs="Arial"/>
           <w:szCs w:val="20"/>
         </w:rPr>
-        <w:t>Sollten Sie diesen Termin nicht einhalten und keine Zahlung tätigen, dann müssen wir Ihnen die Kosten des Mahnverfahrens und die darauffolgenden Verzugszinsen ebenfalls in Rechnung stellen.</w:t>
+        <w:t>S</w:t>
+      </w:r>
+      <w:r>
+        <w:rPr>
+          <w:rFonts w:ascii="Arial" w:hAnsi="Arial" w:cs="Arial"/>
+          <w:szCs w:val="20"/>
+        </w:rPr>
+        <w:t>ollte auch diese Zahlungsfrist ungenutzt verstreichen, behalten wir uns vor, weitere Schritte einzuleiten und Ihnen die daraus entstehenden Kosten in Rechnung zu stellen</w:t>
+      </w:r>
+      <w:r>
+        <w:rPr>
+          <w:rFonts w:ascii="Arial" w:hAnsi="Arial" w:cs="Arial"/>
+          <w:szCs w:val="20"/>
+        </w:rPr>
+        <w:t>.</w:t>
       </w:r>
     </w:p>
     <w:p>
@@ -727,6 +741,15 @@
         </w:rPr>
         <w:t xml:space="preserve">Bei Rückfragen oder etwaigen Beanstandungen bezüglich der erworbenen Leistung können Sie sich jederzeit gerne an uns wenden. </w:t>
       </w:r>
+    </w:p>
+    <w:p>
+      <w:pPr>
+        <w:spacing w:line="360" w:lineRule="auto"/>
+        <w:rPr>
+          <w:rFonts w:ascii="Arial" w:hAnsi="Arial" w:cs="Arial"/>
+          <w:szCs w:val="20"/>
+        </w:rPr>
+      </w:pPr>
     </w:p>
     <w:p>
       <w:pPr>
@@ -2183,6 +2206,7 @@
     <w:rsid w:val="00174882"/>
     <w:rsid w:val="001E59F2"/>
     <w:rsid w:val="00452576"/>
+    <w:rsid w:val="00455EE6"/>
     <w:rsid w:val="004E6C19"/>
     <w:rsid w:val="005310DA"/>
     <w:rsid w:val="00582051"/>
@@ -2200,6 +2224,7 @@
     <w:rsid w:val="00E362F8"/>
     <w:rsid w:val="00EB294F"/>
     <w:rsid w:val="00F30B8B"/>
+    <w:rsid w:val="00FF6532"/>
   </w:rsids>
   <m:mathPr>
     <m:mathFont m:val="Cambria Math"/>

</xml_diff>